<commit_message>
Trim the research briefing in English and Korean
Drop the preconditions paragraph from the summary so it fits on one
page, and remove 2.5 (limitations), 4.4 (counter-arguments), 5.1
(principles), 5.4 (what the Foundation will not do) and the C5/B3
notes. Key safeguards stay as one sentence in section 5 and in the
section 6 risk table; cross-references and numbering are updated.

Co-Authored-By: Claude Opus 5.5 <noreply@anthropic.com>
Claude-Session: https://claude.ai/code/session_01DwyReAbHuerDM9qQp6F7Yx
</commit_message>
<xml_diff>
--- a/research-asean-china-ai-en.docx
+++ b/research-asean-china-ai-en.docx
@@ -378,7 +378,7 @@
         <w:rPr>
           <w:rFonts w:eastAsia="Calibri"/>
         </w:rPr>
-        <w:t xml:space="preserve">: The ASEAN Foundation's place in ASEAN–China AI cooperation lies in the capabilities of 'people and businesses that use AI', and above all in </w:t>
+        <w:t xml:space="preserve">: In ASEAN–China AI cooperation, the ASEAN Foundation's place is with the people and businesses that use AI, and above all with </w:t>
       </w:r>
       <w:r>
         <w:rPr>
@@ -386,13 +386,13 @@
           <w:b/>
           <w:bCs/>
         </w:rPr>
-        <w:t>the stage at which completed training translates into actual use</w:t>
-      </w:r>
-      <w:r>
-        <w:rPr>
-          <w:rFonts w:eastAsia="Calibri"/>
-        </w:rPr>
-        <w:t>. The MSME track is the first priority for this visit. The Foundation should open with the CIIS roundtable remarks (A3) and put forward, as the direction of its contribution, the three points that the Singapore local implementing partner (LIP) set out in the key summaries of its final report: linking training to implementation, building AI-bilingual teams, and measuring responsible use and business outcomes. The teacher track (C1) is structurally important but remains a conditional task, to be pursued after confirming whether China's Smart Education includes teachers and reporting to SOM-ED.</w:t>
+        <w:t>the stage at which training turns into actual use</w:t>
+      </w:r>
+      <w:r>
+        <w:rPr>
+          <w:rFonts w:eastAsia="Calibri"/>
+        </w:rPr>
+        <w:t>. The MSME track is the first priority for this visit. The Foundation should open with the CIIS roundtable remarks (A3) and put forward the three key summaries of the Singapore local implementing partner's (LIP) final report: linking training to implementation, building AI-bilingual teams, and measuring responsible use and business outcomes. The teacher track (C1) follows once it is confirmed whether China's Smart Education includes teachers and SOM-ED has been informed. Whatever the option, the Foundation must first confirm what its funders will allow. The next decision point is the Manila Summit in November 2026.</w:t>
       </w:r>
     </w:p>
     <w:p>
@@ -411,13 +411,13 @@
           <w:b/>
           <w:bCs/>
         </w:rPr>
-        <w:t>ASEAN–China AI cooperation has broadened to cover almost every AI layer.</w:t>
-      </w:r>
-      <w:r>
-        <w:rPr>
-          <w:rFonts w:eastAsia="Calibri"/>
-        </w:rPr>
-        <w:t xml:space="preserve"> It now spans governance (the ministerial roundtable on AI and the September 2026 initiative on AI ethics and safety cooperation for ASEAN), industrial application (the China–ASEAN AI Industry Innovation Centre (Beijing), the China–ASEAN AI Application Cooperation Centre (Nanning) and a casebook of 31 cases), talent (the Ministry of Science and Technology's three-year plan and training at the Innovation Centre; ASEAN's share of the 5,000 AI training sessions and seminars China has offered to developing countries as a whole is not confirmed) and language and data (the Lao national language model and the ASEAN AI open-source community). The talent programmes, however, are presented only in terms of numbers and target groups; how use after training is supported and measured has not been made public.</w:t>
+        <w:t>ASEAN–China AI cooperation now covers almost every AI layer</w:t>
+      </w:r>
+      <w:r>
+        <w:rPr>
+          <w:rFonts w:eastAsia="Calibri"/>
+        </w:rPr>
+        <w:t>: governance (the ministerial roundtable on AI and the September 2026 initiative on AI ethics and safety), industrial application (the China–ASEAN AI Industry Innovation Centre in Beijing and the AI Application Cooperation Centre in Nanning), talent (the Ministry of Science and Technology's three-year plan and 5,000 AI training and seminar opportunities for developing countries; ASEAN's share not confirmed) and language and data. Talent programmes, however, are presented only as numbers; how use after training is supported and measured has not been made public.</w:t>
       </w:r>
     </w:p>
     <w:p>
@@ -436,13 +436,13 @@
           <w:b/>
           <w:bCs/>
         </w:rPr>
-        <w:t>The gaps are 'the layer of AI users' and the stage 'after training'.</w:t>
-      </w:r>
-      <w:r>
-        <w:rPr>
-          <w:rFonts w:eastAsia="Calibri"/>
-        </w:rPr>
-        <w:t xml:space="preserve"> For teachers, citizens and MSMEs, there is only AI education offered by Chinese companies and platforms, together with Smart Education, whose target groups have not been disclosed; no ASEAN-led, technology-neutral AI capability programme is linked to the cooperation. Among students, 72.4 per cent have never taken an AI course; among educators, 70.5 per cent. The Singapore Convening found that even in Singapore, with its robust policy and support environment, support tends to break off between awareness, experimentation, implementation and scaling. Separately, IMDA figures put Singapore's 2025 AI adoption rate at 23.4 per cent for SMEs and 70.4 per cent for other firms (the Convening did not address adoption rates by firm size).</w:t>
+        <w:t>The gaps are the people who use AI and the stage after training.</w:t>
+      </w:r>
+      <w:r>
+        <w:rPr>
+          <w:rFonts w:eastAsia="Calibri"/>
+        </w:rPr>
+        <w:t xml:space="preserve"> No ASEAN-led, technology-neutral AI capacity programme for teachers, citizens or MSMEs is linked to the cooperation. Some 72.4 per cent of students and 70.5 per cent of educators have never taken an AI course. The Singapore Convening found that even where policy support is strong, help tends to break off between awareness, experimentation, implementation and scaling. Singapore's 2025 AI adoption rate was 23.4 per cent for SMEs and 70.4 per cent for other firms (IMDA).</w:t>
       </w:r>
     </w:p>
     <w:p>
@@ -461,47 +461,13 @@
           <w:b/>
           <w:bCs/>
         </w:rPr>
-        <w:t>The Foundation has assets for this stage, and a partner's recommendations set out the role it would play (subject to agreement).</w:t>
-      </w:r>
-      <w:r>
-        <w:rPr>
-          <w:rFonts w:eastAsia="Calibri"/>
-        </w:rPr>
-        <w:t xml:space="preserve"> The assets are a delivery network (more than 3,000 Master Trainers and local partners) and an evidence base (the AI readiness research and the Convening records); the role is the one the Singapore partner recommended to the Foundation (a common 'pathway after training' that local partners adapt and apply, common outcome indicators and regional case exchange). The most persuasive argument pairs supply-side AI safety measures, such as model testing, with a demand-side measure: users' capability to use AI responsibly in their everyday decisions.</w:t>
-      </w:r>
-    </w:p>
-    <w:p>
-      <w:pPr>
-        <w:spacing w:after="120" w:line="336" w:lineRule="auto"/>
-        <w:jc w:val="both"/>
-      </w:pPr>
-      <w:r>
-        <w:rPr>
-          <w:rFonts w:eastAsia="Calibri"/>
-          <w:b/>
-          <w:bCs/>
-        </w:rPr>
-        <w:t>The preconditions</w:t>
-      </w:r>
-      <w:r>
-        <w:rPr>
-          <w:rFonts w:eastAsia="Calibri"/>
-        </w:rPr>
-        <w:t xml:space="preserve"> are confirmation of what the funders (Google.org, AVPN and ADB) will allow; an explicit statement of the principles of ASEAN ownership, working through member states, openness and technology neutrality; and agreement on the Foundation's role in the Singapore follow-up work, both internally and with the LIP and partners. </w:t>
-      </w:r>
-      <w:r>
-        <w:rPr>
-          <w:rFonts w:eastAsia="Calibri"/>
-          <w:b/>
-          <w:bCs/>
-        </w:rPr>
-        <w:t>The next decision point</w:t>
-      </w:r>
-      <w:r>
-        <w:rPr>
-          <w:rFonts w:eastAsia="Calibri"/>
-        </w:rPr>
-        <w:t xml:space="preserve"> is the Manila Summit in November 2026. At stake are the possible adoption of the 2027 ASEAN–China Year of AI Cooperation and the leaders' declaration on AI-driven MSME growth being pursued by the Philippines as ASEAN Chair.</w:t>
+        <w:t>The Foundation has the assets for this stage</w:t>
+      </w:r>
+      <w:r>
+        <w:rPr>
+          <w:rFonts w:eastAsia="Calibri"/>
+        </w:rPr>
+        <w:t>: a delivery network (more than 3,000 Master Trainers and local partners), evidence (the AI readiness research and the Convening records) and a role its Singapore partner has recommended (a common pathway after training, common outcome indicators and regional case exchange; subject to agreement). The most persuasive argument pairs supply-side AI safety measures, such as model testing, with a demand-side one: users' capacity to use AI responsibly.</w:t>
       </w:r>
     </w:p>
     <w:p>
@@ -2027,148 +1993,6 @@
           <w:rFonts w:eastAsia="Calibri"/>
         </w:rPr>
         <w:t xml:space="preserve"> These findings matter for three reasons. First, they document from the field that, even in an ecosystem with strong policy and support, the bottleneck lies 'after training'. Second, the role the Foundation would play (a common pathway, outcome indicators, case exchanges) is set out in the partner's recommendations (subject to agreement), so the contribution it would offer the Chinese side is not an abstract proposal but builds on follow-up work the partner has already proposed. Third, the record that there was no single preference for any type of model provides field evidence for the principle of technology neutrality. As the report itself points out, however, Singapore has a strong institutional ecosystem and is geographically small. Any generalisation must also draw on results from other countries, such as Indonesia.</w:t>
-      </w:r>
-    </w:p>
-    <w:p>
-      <w:pPr>
-        <w:keepNext/>
-        <w:spacing w:before="220" w:after="110" w:line="300" w:lineRule="auto"/>
-      </w:pPr>
-      <w:r>
-        <w:rPr>
-          <w:rFonts w:eastAsia="Calibri"/>
-          <w:b/>
-          <w:bCs/>
-          <w:color w:val="0F63A8"/>
-          <w:sz w:val="22"/>
-          <w:szCs w:val="22"/>
-        </w:rPr>
-        <w:t>2.5 Limitations: What to Resolve Before Presenting Externally</w:t>
-      </w:r>
-    </w:p>
-    <w:p>
-      <w:pPr>
-        <w:pStyle w:val="a4"/>
-        <w:numPr>
-          <w:ilvl w:val="0"/>
-          <w:numId w:val="2"/>
-        </w:numPr>
-        <w:spacing w:after="60" w:line="336" w:lineRule="auto"/>
-        <w:jc w:val="both"/>
-      </w:pPr>
-      <w:r>
-        <w:rPr>
-          <w:rFonts w:eastAsia="Calibri"/>
-          <w:b/>
-          <w:bCs/>
-        </w:rPr>
-        <w:t>Distinguishing reach from learning outcomes</w:t>
-      </w:r>
-      <w:r>
-        <w:rPr>
-          <w:rFonts w:eastAsia="Calibri"/>
-        </w:rPr>
-        <w:t>: '5 million reached' and '100,000 in-depth course completions' are different indicators. Phase 1 targeted in-depth training for 800,000 people through Master Trainers. Whether the two figures are defined in the same way needs to be checked; where definitions are ambiguous, counterparts will discount the results as a whole. The Singapore LIP report likewise recommended distinguishing reach, business integration and verified outcomes in regional reporting.</w:t>
-      </w:r>
-    </w:p>
-    <w:p>
-      <w:pPr>
-        <w:pStyle w:val="a4"/>
-        <w:numPr>
-          <w:ilvl w:val="0"/>
-          <w:numId w:val="2"/>
-        </w:numPr>
-        <w:spacing w:after="60" w:line="336" w:lineRule="auto"/>
-        <w:jc w:val="both"/>
-      </w:pPr>
-      <w:r>
-        <w:rPr>
-          <w:rFonts w:eastAsia="Calibri"/>
-          <w:b/>
-          <w:bCs/>
-        </w:rPr>
-        <w:t>Shift in target groups</w:t>
-      </w:r>
-      <w:r>
-        <w:rPr>
-          <w:rFonts w:eastAsia="Calibri"/>
-        </w:rPr>
-        <w:t>: Phase 2 of AI Ready ASEAN centres on teachers and universities. AI literacy for parents and vulnerable groups is left to the legacy of Phase 1 (content and trainers).</w:t>
-      </w:r>
-    </w:p>
-    <w:p>
-      <w:pPr>
-        <w:pStyle w:val="a4"/>
-        <w:numPr>
-          <w:ilvl w:val="0"/>
-          <w:numId w:val="2"/>
-        </w:numPr>
-        <w:spacing w:after="60" w:line="336" w:lineRule="auto"/>
-        <w:jc w:val="both"/>
-      </w:pPr>
-      <w:r>
-        <w:rPr>
-          <w:rFonts w:eastAsia="Calibri"/>
-          <w:b/>
-          <w:bCs/>
-        </w:rPr>
-        <w:t>Member state coverage</w:t>
-      </w:r>
-      <w:r>
-        <w:rPr>
-          <w:rFonts w:eastAsia="Calibri"/>
-        </w:rPr>
-        <w:t>: Both programmes were designed for 10 member states. Timor-Leste became the 11th member state in October 2025, but Tetum-language AI content and local partners there are not confirmed.</w:t>
-      </w:r>
-    </w:p>
-    <w:p>
-      <w:pPr>
-        <w:pStyle w:val="a4"/>
-        <w:numPr>
-          <w:ilvl w:val="0"/>
-          <w:numId w:val="2"/>
-        </w:numPr>
-        <w:spacing w:after="60" w:line="336" w:lineRule="auto"/>
-        <w:jc w:val="both"/>
-      </w:pPr>
-      <w:r>
-        <w:rPr>
-          <w:rFonts w:eastAsia="Calibri"/>
-          <w:b/>
-          <w:bCs/>
-        </w:rPr>
-        <w:t>Neutrality of funding and AI tools</w:t>
-      </w:r>
-      <w:r>
-        <w:rPr>
-          <w:rFonts w:eastAsia="Calibri"/>
-        </w:rPr>
-        <w:t>: Both programmes rely on private foundations and funds, and the announcement of AIM ASEAN's local partners (October 2025) includes the phrase "use of Google's suite of AI tools". In cooperation with the Chinese side, the first question could be which AI tools are used for teaching (section 6).</w:t>
-      </w:r>
-    </w:p>
-    <w:p>
-      <w:pPr>
-        <w:pStyle w:val="a4"/>
-        <w:numPr>
-          <w:ilvl w:val="0"/>
-          <w:numId w:val="2"/>
-        </w:numPr>
-        <w:spacing w:after="120" w:line="336" w:lineRule="auto"/>
-        <w:jc w:val="both"/>
-      </w:pPr>
-      <w:r>
-        <w:rPr>
-          <w:rFonts w:eastAsia="Calibri"/>
-          <w:b/>
-          <w:bCs/>
-        </w:rPr>
-        <w:t>Scope of disclosure for internal material</w:t>
-      </w:r>
-      <w:r>
-        <w:rPr>
-          <w:rFonts w:eastAsia="Calibri"/>
-        </w:rPr>
-        <w:t>: The structured evidence for the Singapore findings is the LIP's internal report (submission date of the final version not yet fixed; it includes participants' names and the event budget). External documents and remarks should draw on it only to the extent covered by public press releases, or in the form of an anonymised summary.</w:t>
       </w:r>
     </w:p>
     <w:p>
@@ -5952,6 +5776,140 @@
     </w:p>
     <w:p>
       <w:pPr>
+        <w:spacing w:after="120" w:line="336" w:lineRule="auto"/>
+        <w:jc w:val="both"/>
+      </w:pPr>
+      <w:r>
+        <w:rPr>
+          <w:rFonts w:eastAsia="Calibri"/>
+          <w:b/>
+          <w:bCs/>
+          <w:color w:val="0F63A8"/>
+        </w:rPr>
+        <w:t>[Assessment]</w:t>
+      </w:r>
+      <w:r>
+        <w:rPr>
+          <w:rFonts w:eastAsia="Calibri"/>
+        </w:rPr>
+        <w:t xml:space="preserve"> There are three gaps: in target groups (the capacity of teachers, citizens and MSMEs to use AI), in stages (support and measurement for implementation and scaling after training) and in coordination (between dispersed AI channels on the Chinese side and existing programmes on the ASEAN side). At the CIIS session on industry, the MSME 'after training' stage is the most concrete illustration of these gaps.</w:t>
+      </w:r>
+    </w:p>
+    <w:p>
+      <w:pPr>
+        <w:keepNext/>
+        <w:spacing w:before="240" w:after="160" w:line="300" w:lineRule="auto"/>
+      </w:pPr>
+      <w:r>
+        <w:rPr>
+          <w:rFonts w:eastAsia="Calibri"/>
+          <w:b/>
+          <w:bCs/>
+          <w:color w:val="00498F"/>
+          <w:sz w:val="26"/>
+          <w:szCs w:val="26"/>
+        </w:rPr>
+        <w:t>5. How the Foundation Can Contribute</w:t>
+      </w:r>
+    </w:p>
+    <w:p>
+      <w:pPr>
+        <w:spacing w:after="120" w:line="336" w:lineRule="auto"/>
+        <w:jc w:val="both"/>
+      </w:pPr>
+      <w:r>
+        <w:rPr>
+          <w:rFonts w:eastAsia="Calibri"/>
+        </w:rPr>
+        <w:t>The recommendation runs on two tracks.</w:t>
+      </w:r>
+    </w:p>
+    <w:p>
+      <w:pPr>
+        <w:spacing w:after="120" w:line="336" w:lineRule="auto"/>
+        <w:jc w:val="both"/>
+      </w:pPr>
+      <w:r>
+        <w:rPr>
+          <w:rFonts w:eastAsia="Calibri"/>
+          <w:b/>
+          <w:bCs/>
+        </w:rPr>
+        <w:t>The immediate track is MSMEs.</w:t>
+      </w:r>
+      <w:r>
+        <w:rPr>
+          <w:rFonts w:eastAsia="Calibri"/>
+        </w:rPr>
+        <w:t xml:space="preserve"> Everything is already in place: evidence (the record of the Singapore Convening), an institutional basis (AIM ASEAN, endorsed by ACCMSME), proposed follow-up tasks (common outcome indicators and case exchange, subject to partner agreement) and opportunities (the CIIS industry session and the declaration of the Philippine-chaired summit in November). The Foundation presents A3, A4, B4, D1 and C5 together under a single message: 'we take on what comes after training'.</w:t>
+      </w:r>
+    </w:p>
+    <w:p>
+      <w:pPr>
+        <w:spacing w:after="120" w:line="336" w:lineRule="auto"/>
+        <w:jc w:val="both"/>
+      </w:pPr>
+      <w:r>
+        <w:rPr>
+          <w:rFonts w:eastAsia="Calibri"/>
+          <w:b/>
+          <w:bCs/>
+        </w:rPr>
+        <w:t>The structural track is teachers.</w:t>
+      </w:r>
+      <w:r>
+        <w:rPr>
+          <w:rFonts w:eastAsia="Calibri"/>
+        </w:rPr>
+        <w:t xml:space="preserve"> Teachers' AI competence (C1) ties directly into Phase 2 of AI Ready ASEAN, endorsed by SOM-ED, but the target groups of China's Smart Education have not been made public, so exploration must come first. If teachers are included, the timing is right to prevent duplication now; if not, C1 shifts to complementarity, filling a gap (a proposal to link up at the teacher level). Either way, the Foundation reports to SOM-ED before proceeding.</w:t>
+      </w:r>
+    </w:p>
+    <w:p>
+      <w:pPr>
+        <w:spacing w:after="120" w:line="336" w:lineRule="auto"/>
+        <w:jc w:val="both"/>
+      </w:pPr>
+      <w:r>
+        <w:rPr>
+          <w:rFonts w:eastAsia="Calibri"/>
+          <w:b/>
+          <w:bCs/>
+        </w:rPr>
+        <w:t>[Assessment] Why MSMEs are the first priority.</w:t>
+      </w:r>
+      <w:r>
+        <w:rPr>
+          <w:rFonts w:eastAsia="Calibri"/>
+        </w:rPr>
+        <w:t xml:space="preserve"> First, the evidence on the MSME side is more specific and more recent. Second, partners have recommended the role the Foundation would play (subject to agreement). Third, AIM ASEAN is scheduled to end in 2027, so securing a follow-up link is urgent. Fourth, C1 rests on a premise not yet confirmed (whether Smart Education covers teachers).</w:t>
+      </w:r>
+    </w:p>
+    <w:p>
+      <w:pPr>
+        <w:spacing w:after="120" w:line="336" w:lineRule="auto"/>
+        <w:jc w:val="both"/>
+      </w:pPr>
+      <w:r>
+        <w:rPr>
+          <w:rFonts w:eastAsia="Calibri"/>
+        </w:rPr>
+        <w:t>On this visit, Session 2 of the CIIS roundtable is the first opportunity to act. The meeting with the Ministry of Education will go no further than introducing A1 and A2 and confirming Smart Education's target groups and the channel for consultation. Both tracks share the same logic: ASEAN has the networks that carry AI through to the ground, and the evidence of how it is used after training.</w:t>
+      </w:r>
+    </w:p>
+    <w:p>
+      <w:pPr>
+        <w:spacing w:after="120" w:line="336" w:lineRule="auto"/>
+        <w:jc w:val="both"/>
+      </w:pPr>
+      <w:r>
+        <w:rPr>
+          <w:rFonts w:eastAsia="Calibri"/>
+        </w:rPr>
+        <w:t>All options rest on ASEAN ownership, working through member states, openness to other Dialogue Partners and technology neutrality. The Foundation will not provide learner data or state ASEAN positions on AI standards and norms.</w:t>
+      </w:r>
+    </w:p>
+    <w:p>
+      <w:pPr>
         <w:keepNext/>
         <w:spacing w:before="220" w:after="110" w:line="300" w:lineRule="auto"/>
       </w:pPr>
@@ -5964,742 +5922,7 @@
           <w:sz w:val="22"/>
           <w:szCs w:val="22"/>
         </w:rPr>
-        <w:t>4.4 Counter-arguments</w:t>
-      </w:r>
-    </w:p>
-    <w:tbl>
-      <w:tblPr>
-        <w:tblW w:w="9740" w:type="dxa"/>
-        <w:tblBorders>
-          <w:top w:val="single" w:sz="4" w:space="0" w:color="C3D6E8"/>
-          <w:left w:val="single" w:sz="4" w:space="0" w:color="C3D6E8"/>
-          <w:bottom w:val="single" w:sz="4" w:space="0" w:color="C3D6E8"/>
-          <w:right w:val="single" w:sz="4" w:space="0" w:color="C3D6E8"/>
-          <w:insideH w:val="single" w:sz="4" w:space="0" w:color="C3D6E8"/>
-          <w:insideV w:val="single" w:sz="4" w:space="0" w:color="C3D6E8"/>
-        </w:tblBorders>
-        <w:tblLayout w:type="fixed"/>
-        <w:tblCellMar>
-          <w:top w:w="90" w:type="dxa"/>
-          <w:left w:w="106" w:type="dxa"/>
-          <w:bottom w:w="90" w:type="dxa"/>
-          <w:right w:w="106" w:type="dxa"/>
-        </w:tblCellMar>
-        <w:tblLook w:val="04A0" w:firstRow="1" w:lastRow="0" w:firstColumn="1" w:lastColumn="0" w:noHBand="0" w:noVBand="1"/>
-      </w:tblPr>
-      <w:tblGrid>
-        <w:gridCol w:w="2161"/>
-        <w:gridCol w:w="4019"/>
-        <w:gridCol w:w="3560"/>
-      </w:tblGrid>
-      <w:tr>
-        <w:trPr>
-          <w:tblHeader/>
-        </w:trPr>
-        <w:tc>
-          <w:tcPr>
-            <w:tcW w:w="2161" w:type="dxa"/>
-            <w:shd w:val="clear" w:color="auto" w:fill="00498F"/>
-          </w:tcPr>
-          <w:p>
-            <w:pPr>
-              <w:spacing w:line="276" w:lineRule="auto"/>
-            </w:pPr>
-            <w:r>
-              <w:rPr>
-                <w:rFonts w:eastAsia="Calibri"/>
-                <w:b/>
-                <w:bCs/>
-                <w:color w:val="FFFFFF"/>
-              </w:rPr>
-              <w:t>Anticipated counter-argument</w:t>
-            </w:r>
-          </w:p>
-        </w:tc>
-        <w:tc>
-          <w:tcPr>
-            <w:tcW w:w="4019" w:type="dxa"/>
-            <w:shd w:val="clear" w:color="auto" w:fill="00498F"/>
-          </w:tcPr>
-          <w:p>
-            <w:pPr>
-              <w:spacing w:line="276" w:lineRule="auto"/>
-            </w:pPr>
-            <w:r>
-              <w:rPr>
-                <w:rFonts w:eastAsia="Calibri"/>
-                <w:b/>
-                <w:bCs/>
-                <w:color w:val="FFFFFF"/>
-              </w:rPr>
-              <w:t>Response</w:t>
-            </w:r>
-          </w:p>
-        </w:tc>
-        <w:tc>
-          <w:tcPr>
-            <w:tcW w:w="3560" w:type="dxa"/>
-            <w:shd w:val="clear" w:color="auto" w:fill="00498F"/>
-          </w:tcPr>
-          <w:p>
-            <w:pPr>
-              <w:spacing w:line="276" w:lineRule="auto"/>
-            </w:pPr>
-            <w:r>
-              <w:rPr>
-                <w:rFonts w:eastAsia="Calibri"/>
-                <w:b/>
-                <w:bCs/>
-                <w:color w:val="FFFFFF"/>
-              </w:rPr>
-              <w:t>Adjustment to the argument</w:t>
-            </w:r>
-          </w:p>
-        </w:tc>
-      </w:tr>
-      <w:tr>
-        <w:trPr>
-          <w:cantSplit/>
-        </w:trPr>
-        <w:tc>
-          <w:tcPr>
-            <w:tcW w:w="2161" w:type="dxa"/>
-          </w:tcPr>
-          <w:p>
-            <w:pPr>
-              <w:spacing w:line="276" w:lineRule="auto"/>
-            </w:pPr>
-            <w:r>
-              <w:rPr>
-                <w:rFonts w:eastAsia="Calibri"/>
-              </w:rPr>
-              <w:t>Chinese companies and platforms already provide AI education</w:t>
-            </w:r>
-          </w:p>
-        </w:tc>
-        <w:tc>
-          <w:tcPr>
-            <w:tcW w:w="4019" w:type="dxa"/>
-          </w:tcPr>
-          <w:p>
-            <w:pPr>
-              <w:spacing w:line="276" w:lineRule="auto"/>
-            </w:pPr>
-            <w:r>
-              <w:rPr>
-                <w:rFonts w:eastAsia="Calibri"/>
-              </w:rPr>
-              <w:t>True. There are Huawei Seeds for the Future and TECH4ALL, platform-specific seller training, and vocational education hubs in Guangxi and Guizhou. The Foundation, too, ran ASEAN Seeds for the Future with Huawei (2021 MoU). These efforts are, however, fragmented by provider and do not presuppose common ASEAN standards. The Foundation's own programmes use Google's suite of AI tools (see 2.5) and could face the same criticism</w:t>
-            </w:r>
-          </w:p>
-        </w:tc>
-        <w:tc>
-          <w:tcPr>
-            <w:tcW w:w="3560" w:type="dxa"/>
-          </w:tcPr>
-          <w:p>
-            <w:pPr>
-              <w:spacing w:line="276" w:lineRule="auto"/>
-            </w:pPr>
-            <w:r>
-              <w:rPr>
-                <w:rFonts w:eastAsia="Calibri"/>
-              </w:rPr>
-              <w:t>Define the gap not as an 'absence' but as an 'absence of ASEAN-led, technology-neutral public goods'. Have the Foundation itself set out the principle of technology neutrality first</w:t>
-            </w:r>
-          </w:p>
-        </w:tc>
-      </w:tr>
-      <w:tr>
-        <w:trPr>
-          <w:cantSplit/>
-        </w:trPr>
-        <w:tc>
-          <w:tcPr>
-            <w:tcW w:w="2161" w:type="dxa"/>
-          </w:tcPr>
-          <w:p>
-            <w:pPr>
-              <w:spacing w:line="276" w:lineRule="auto"/>
-            </w:pPr>
-            <w:r>
-              <w:rPr>
-                <w:rFonts w:eastAsia="Calibri"/>
-              </w:rPr>
-              <w:t>The 5,000 AI training sessions and Smart Education will cover this group</w:t>
-            </w:r>
-          </w:p>
-        </w:tc>
-        <w:tc>
-          <w:tcPr>
-            <w:tcW w:w="4019" w:type="dxa"/>
-          </w:tcPr>
-          <w:p>
-            <w:pPr>
-              <w:spacing w:line="276" w:lineRule="auto"/>
-            </w:pPr>
-            <w:r>
-              <w:rPr>
-                <w:rFonts w:eastAsia="Calibri"/>
-              </w:rPr>
-              <w:t>Possibly. With the details unpublished, no firm conclusion can be drawn. If they take shape as AI training for teachers, they could target the same schools as AI Ready ASEAN Phase 2</w:t>
-            </w:r>
-          </w:p>
-        </w:tc>
-        <w:tc>
-          <w:tcPr>
-            <w:tcW w:w="3560" w:type="dxa"/>
-          </w:tcPr>
-          <w:p>
-            <w:pPr>
-              <w:spacing w:line="276" w:lineRule="auto"/>
-            </w:pPr>
-            <w:r>
-              <w:rPr>
-                <w:rFonts w:eastAsia="Calibri"/>
-              </w:rPr>
-              <w:t>Avoiding duplication and ensuring complementarity become consultation agenda items in their own right</w:t>
-            </w:r>
-          </w:p>
-        </w:tc>
-      </w:tr>
-      <w:tr>
-        <w:trPr>
-          <w:cantSplit/>
-        </w:trPr>
-        <w:tc>
-          <w:tcPr>
-            <w:tcW w:w="2161" w:type="dxa"/>
-          </w:tcPr>
-          <w:p>
-            <w:pPr>
-              <w:spacing w:line="276" w:lineRule="auto"/>
-            </w:pPr>
-            <w:r>
-              <w:rPr>
-                <w:rFonts w:eastAsia="Calibri"/>
-              </w:rPr>
-              <w:t>AI literacy and MSME support are domestic policy matters for member states</w:t>
-            </w:r>
-          </w:p>
-        </w:tc>
-        <w:tc>
-          <w:tcPr>
-            <w:tcW w:w="4019" w:type="dxa"/>
-          </w:tcPr>
-          <w:p>
-            <w:pPr>
-              <w:spacing w:line="276" w:lineRule="auto"/>
-            </w:pPr>
-            <w:r>
-              <w:rPr>
-                <w:rFonts w:eastAsia="Calibri"/>
-              </w:rPr>
-              <w:t>True. Education falls within member states' sovereign remit, and MSME policy likewise rests with member states' line ministries</w:t>
-            </w:r>
-          </w:p>
-        </w:tc>
-        <w:tc>
-          <w:tcPr>
-            <w:tcW w:w="3560" w:type="dxa"/>
-          </w:tcPr>
-          <w:p>
-            <w:pPr>
-              <w:spacing w:line="276" w:lineRule="auto"/>
-            </w:pPr>
-            <w:r>
-              <w:rPr>
-                <w:rFonts w:eastAsia="Calibri"/>
-              </w:rPr>
-              <w:t>Present endorsement by SOM-ED and ACCMSME, together with member-state coordination structures, as the entry route</w:t>
-            </w:r>
-          </w:p>
-        </w:tc>
-      </w:tr>
-      <w:tr>
-        <w:trPr>
-          <w:cantSplit/>
-        </w:trPr>
-        <w:tc>
-          <w:tcPr>
-            <w:tcW w:w="2161" w:type="dxa"/>
-          </w:tcPr>
-          <w:p>
-            <w:pPr>
-              <w:spacing w:line="276" w:lineRule="auto"/>
-            </w:pPr>
-            <w:r>
-              <w:rPr>
-                <w:rFonts w:eastAsia="Calibri"/>
-              </w:rPr>
-              <w:t>AI infrastructure and industrial deployment come first</w:t>
-            </w:r>
-          </w:p>
-        </w:tc>
-        <w:tc>
-          <w:tcPr>
-            <w:tcW w:w="4019" w:type="dxa"/>
-          </w:tcPr>
-          <w:p>
-            <w:pPr>
-              <w:spacing w:line="276" w:lineRule="auto"/>
-            </w:pPr>
-            <w:r>
-              <w:rPr>
-                <w:rFonts w:eastAsia="Calibri"/>
-              </w:rPr>
-              <w:t>The sequencing logic is sound. But as deployment grows, the shortfall in user capacity comes back as low utilisation, deepfake scams and disinformation. Even in Singapore, the SME adoption rate is 23.4 per cent</w:t>
-            </w:r>
-          </w:p>
-        </w:tc>
-        <w:tc>
-          <w:tcPr>
-            <w:tcW w:w="3560" w:type="dxa"/>
-          </w:tcPr>
-          <w:p>
-            <w:pPr>
-              <w:spacing w:line="276" w:lineRule="auto"/>
-            </w:pPr>
-            <w:r>
-              <w:rPr>
-                <w:rFonts w:eastAsia="Calibri"/>
-              </w:rPr>
-              <w:t>Present user capacity as a condition for a return on AI investment and as a demand-side measure for AI safety</w:t>
-            </w:r>
-          </w:p>
-        </w:tc>
-      </w:tr>
-      <w:tr>
-        <w:trPr>
-          <w:cantSplit/>
-        </w:trPr>
-        <w:tc>
-          <w:tcPr>
-            <w:tcW w:w="2161" w:type="dxa"/>
-          </w:tcPr>
-          <w:p>
-            <w:pPr>
-              <w:spacing w:line="276" w:lineRule="auto"/>
-            </w:pPr>
-            <w:r>
-              <w:rPr>
-                <w:rFonts w:eastAsia="Calibri"/>
-              </w:rPr>
-              <w:t>Training numbers are already sufficient; what is needed is high-level talent</w:t>
-            </w:r>
-          </w:p>
-        </w:tc>
-        <w:tc>
-          <w:tcPr>
-            <w:tcW w:w="4019" w:type="dxa"/>
-          </w:tcPr>
-          <w:p>
-            <w:pPr>
-              <w:spacing w:line="276" w:lineRule="auto"/>
-            </w:pPr>
-            <w:r>
-              <w:rPr>
-                <w:rFonts w:eastAsia="Calibri"/>
-              </w:rPr>
-              <w:t>The official track covers high-level talent. The problem is not numbers but the fact that changes in capacity and sustained use go unmeasured. The research shows a gap between self-assessed and measured capacity, and the Singapore Convening a break between training and business integration</w:t>
-            </w:r>
-          </w:p>
-        </w:tc>
-        <w:tc>
-          <w:tcPr>
-            <w:tcW w:w="3560" w:type="dxa"/>
-          </w:tcPr>
-          <w:p>
-            <w:pPr>
-              <w:spacing w:line="276" w:lineRule="auto"/>
-            </w:pPr>
-            <w:r>
-              <w:rPr>
-                <w:rFonts w:eastAsia="Calibri"/>
-              </w:rPr>
-              <w:t>Present measurement of sustained use and business outcomes (D1) as an area of contribution</w:t>
-            </w:r>
-          </w:p>
-        </w:tc>
-      </w:tr>
-      <w:tr>
-        <w:trPr>
-          <w:cantSplit/>
-        </w:trPr>
-        <w:tc>
-          <w:tcPr>
-            <w:tcW w:w="2161" w:type="dxa"/>
-          </w:tcPr>
-          <w:p>
-            <w:pPr>
-              <w:spacing w:line="276" w:lineRule="auto"/>
-            </w:pPr>
-            <w:r>
-              <w:rPr>
-                <w:rFonts w:eastAsia="Calibri"/>
-              </w:rPr>
-              <w:t>Singapore is an exceptionally advanced case, so its experience cannot be generalised</w:t>
-            </w:r>
-          </w:p>
-        </w:tc>
-        <w:tc>
-          <w:tcPr>
-            <w:tcW w:w="4019" w:type="dxa"/>
-          </w:tcPr>
-          <w:p>
-            <w:pPr>
-              <w:spacing w:line="276" w:lineRule="auto"/>
-            </w:pPr>
-            <w:r>
-              <w:rPr>
-                <w:rFonts w:eastAsia="Calibri"/>
-              </w:rPr>
-              <w:t xml:space="preserve">True. Its institutional ecosystem is robust and it is geographically small (as the report itself notes). But if training and use come apart even there, the break is likely to be greater where support is thin </w:t>
-            </w:r>
-            <w:r>
-              <w:rPr>
-                <w:rFonts w:eastAsia="Calibri"/>
-                <w:b/>
-                <w:bCs/>
-                <w:color w:val="0F63A8"/>
-              </w:rPr>
-              <w:t>[Assessment]</w:t>
-            </w:r>
-            <w:r>
-              <w:rPr>
-                <w:rFonts w:eastAsia="Calibri"/>
-              </w:rPr>
-              <w:t>. Indonesia showed a different barrier: the literacy gap</w:t>
-            </w:r>
-          </w:p>
-        </w:tc>
-        <w:tc>
-          <w:tcPr>
-            <w:tcW w:w="3560" w:type="dxa"/>
-          </w:tcPr>
-          <w:p>
-            <w:pPr>
-              <w:spacing w:line="276" w:lineRule="auto"/>
-            </w:pPr>
-            <w:r>
-              <w:rPr>
-                <w:rFonts w:eastAsia="Calibri"/>
-              </w:rPr>
-              <w:t>Present it not as a copy of the same programme but as a common pathway (awareness → low-risk adoption → process transformation) adapted by each country. Use the Singapore evidence alongside that from Indonesia and elsewhere</w:t>
-            </w:r>
-          </w:p>
-        </w:tc>
-      </w:tr>
-    </w:tbl>
-    <w:p>
-      <w:pPr>
-        <w:spacing w:after="60" w:line="120" w:lineRule="auto"/>
-      </w:pPr>
-    </w:p>
-    <w:p>
-      <w:pPr>
-        <w:spacing w:after="120" w:line="336" w:lineRule="auto"/>
-        <w:jc w:val="both"/>
-      </w:pPr>
-      <w:r>
-        <w:rPr>
-          <w:rFonts w:eastAsia="Calibri"/>
-          <w:b/>
-          <w:bCs/>
-          <w:color w:val="0F63A8"/>
-        </w:rPr>
-        <w:t>[Assessment]</w:t>
-      </w:r>
-      <w:r>
-        <w:rPr>
-          <w:rFonts w:eastAsia="Calibri"/>
-        </w:rPr>
-        <w:t xml:space="preserve"> There are three gaps: in target groups (the capacity of teachers, citizens and MSMEs to use AI); in stages (support and measurement for implementation and scaling after training); and in coordination (between dispersed AI channels on the Chinese side and existing AI programmes on the ASEAN side). Since both sides have made AI safety a major agenda item (ASEAN AI Safe; the September 2026 initiative on AI ethics and safety cooperation), the most persuasive argument pairs supply-side measures, such as model testing and standards, with demand-side measures: users' AI literacy and responsible use. At the CIIS session on industry, the MSME 'after training' phase is the most concrete illustration of this gap. The same argument should be made for teachers and citizens in the education track and for MSMEs in the industry track.</w:t>
-      </w:r>
-    </w:p>
-    <w:p>
-      <w:pPr>
-        <w:keepNext/>
-        <w:spacing w:before="240" w:after="160" w:line="300" w:lineRule="auto"/>
-      </w:pPr>
-      <w:r>
-        <w:rPr>
-          <w:rFonts w:eastAsia="Calibri"/>
-          <w:b/>
-          <w:bCs/>
-          <w:color w:val="00498F"/>
-          <w:sz w:val="26"/>
-          <w:szCs w:val="26"/>
-        </w:rPr>
-        <w:t>5. How the Foundation Can Contribute</w:t>
-      </w:r>
-    </w:p>
-    <w:p>
-      <w:pPr>
-        <w:spacing w:after="120" w:line="336" w:lineRule="auto"/>
-        <w:jc w:val="both"/>
-      </w:pPr>
-      <w:r>
-        <w:rPr>
-          <w:rFonts w:eastAsia="Calibri"/>
-        </w:rPr>
-        <w:t>The recommendation runs on two tracks.</w:t>
-      </w:r>
-    </w:p>
-    <w:p>
-      <w:pPr>
-        <w:spacing w:after="120" w:line="336" w:lineRule="auto"/>
-        <w:jc w:val="both"/>
-      </w:pPr>
-      <w:r>
-        <w:rPr>
-          <w:rFonts w:eastAsia="Calibri"/>
-          <w:b/>
-          <w:bCs/>
-        </w:rPr>
-        <w:t>The immediate track is MSMEs.</w:t>
-      </w:r>
-      <w:r>
-        <w:rPr>
-          <w:rFonts w:eastAsia="Calibri"/>
-        </w:rPr>
-        <w:t xml:space="preserve"> Everything is already in place: evidence (the record of the Singapore Convening), an institutional basis (AIM ASEAN, endorsed by ACCMSME), proposed follow-up tasks (common outcome indicators and case exchange, subject to partner agreement) and opportunities (the CIIS industry session and the declaration of the Philippine-chaired summit in November). The Foundation presents A3, A4, B4, D1 and C5 together under a single message: 'we take on what comes after training'.</w:t>
-      </w:r>
-    </w:p>
-    <w:p>
-      <w:pPr>
-        <w:spacing w:after="120" w:line="336" w:lineRule="auto"/>
-        <w:jc w:val="both"/>
-      </w:pPr>
-      <w:r>
-        <w:rPr>
-          <w:rFonts w:eastAsia="Calibri"/>
-          <w:b/>
-          <w:bCs/>
-        </w:rPr>
-        <w:t>The structural track is teachers.</w:t>
-      </w:r>
-      <w:r>
-        <w:rPr>
-          <w:rFonts w:eastAsia="Calibri"/>
-        </w:rPr>
-        <w:t xml:space="preserve"> Teachers' AI competence (C1) ties directly into Phase 2 of AI Ready ASEAN, endorsed by SOM-ED, but the target groups of China's Smart Education have not been made public, so exploration must come first. If teachers are included, the timing is right to prevent duplication now; if not, C1 shifts to complementarity, filling a gap (a proposal to link up at the teacher level). Either way, the Foundation reports to SOM-ED before proceeding.</w:t>
-      </w:r>
-    </w:p>
-    <w:p>
-      <w:pPr>
-        <w:spacing w:after="120" w:line="336" w:lineRule="auto"/>
-        <w:jc w:val="both"/>
-      </w:pPr>
-      <w:r>
-        <w:rPr>
-          <w:rFonts w:eastAsia="Calibri"/>
-          <w:b/>
-          <w:bCs/>
-        </w:rPr>
-        <w:t>[Assessment] Why MSMEs are the first priority.</w:t>
-      </w:r>
-      <w:r>
-        <w:rPr>
-          <w:rFonts w:eastAsia="Calibri"/>
-        </w:rPr>
-        <w:t xml:space="preserve"> First, the evidence on the MSME side is more specific and more recent. Second, partners have recommended the role the Foundation would play (subject to agreement). Third, AIM ASEAN is scheduled to end in 2027, so securing a follow-up link is urgent. Fourth, C1 rests on a premise not yet confirmed (whether Smart Education covers teachers).</w:t>
-      </w:r>
-    </w:p>
-    <w:p>
-      <w:pPr>
-        <w:spacing w:after="120" w:line="336" w:lineRule="auto"/>
-        <w:jc w:val="both"/>
-      </w:pPr>
-      <w:r>
-        <w:rPr>
-          <w:rFonts w:eastAsia="Calibri"/>
-        </w:rPr>
-        <w:t>On this visit, Session 2 of the CIIS roundtable is the first opportunity to act. The meeting with the Ministry of Education will go no further than introducing A1 and A2 and confirming Smart Education's target groups and the channel for consultation. Both tracks share the same logic: ASEAN has the networks that carry AI through to the ground, and the evidence of how it is used after training.</w:t>
-      </w:r>
-    </w:p>
-    <w:p>
-      <w:pPr>
-        <w:keepNext/>
-        <w:spacing w:before="220" w:after="110" w:line="300" w:lineRule="auto"/>
-      </w:pPr>
-      <w:r>
-        <w:rPr>
-          <w:rFonts w:eastAsia="Calibri"/>
-          <w:b/>
-          <w:bCs/>
-          <w:color w:val="0F63A8"/>
-          <w:sz w:val="22"/>
-          <w:szCs w:val="22"/>
-        </w:rPr>
-        <w:t>5.1 Principles</w:t>
-      </w:r>
-    </w:p>
-    <w:p>
-      <w:pPr>
-        <w:pStyle w:val="a4"/>
-        <w:numPr>
-          <w:ilvl w:val="0"/>
-          <w:numId w:val="6"/>
-        </w:numPr>
-        <w:spacing w:after="60" w:line="336" w:lineRule="auto"/>
-        <w:jc w:val="both"/>
-      </w:pPr>
-      <w:r>
-        <w:rPr>
-          <w:rFonts w:eastAsia="Calibri"/>
-          <w:b/>
-          <w:bCs/>
-        </w:rPr>
-        <w:t>ASEAN ownership</w:t>
-      </w:r>
-      <w:r>
-        <w:rPr>
-          <w:rFonts w:eastAsia="Calibri"/>
-        </w:rPr>
-        <w:t>: Ownership and branding of AI education content, trainer networks and AI readiness data rest with ASEAN.</w:t>
-      </w:r>
-    </w:p>
-    <w:p>
-      <w:pPr>
-        <w:pStyle w:val="a4"/>
-        <w:numPr>
-          <w:ilvl w:val="0"/>
-          <w:numId w:val="6"/>
-        </w:numPr>
-        <w:spacing w:after="60" w:line="336" w:lineRule="auto"/>
-        <w:jc w:val="both"/>
-      </w:pPr>
-      <w:r>
-        <w:rPr>
-          <w:rFonts w:eastAsia="Calibri"/>
-          <w:b/>
-          <w:bCs/>
-        </w:rPr>
-        <w:t>Through member states</w:t>
-      </w:r>
-      <w:r>
-        <w:rPr>
-          <w:rFonts w:eastAsia="Calibri"/>
-        </w:rPr>
-        <w:t>: Education work goes through SOM-ED and member states' Ministries of Education, and MSME work through ACCMSME and member states' ministries responsible for MSMEs. In digital and AI governance, proposals go to ADGSOM and WG-AI via the ASEAN Secretariat.</w:t>
-      </w:r>
-    </w:p>
-    <w:p>
-      <w:pPr>
-        <w:pStyle w:val="a4"/>
-        <w:numPr>
-          <w:ilvl w:val="0"/>
-          <w:numId w:val="6"/>
-        </w:numPr>
-        <w:spacing w:after="60" w:line="336" w:lineRule="auto"/>
-        <w:jc w:val="both"/>
-      </w:pPr>
-      <w:r>
-        <w:rPr>
-          <w:rFonts w:eastAsia="Calibri"/>
-          <w:b/>
-          <w:bCs/>
-        </w:rPr>
-        <w:t>Openness</w:t>
-      </w:r>
-      <w:r>
-        <w:rPr>
-          <w:rFonts w:eastAsia="Calibri"/>
-        </w:rPr>
-        <w:t>: The same proposals remain open to other Dialogue Partners. Nothing is designed as a China-only programme.</w:t>
-      </w:r>
-    </w:p>
-    <w:p>
-      <w:pPr>
-        <w:pStyle w:val="a4"/>
-        <w:numPr>
-          <w:ilvl w:val="0"/>
-          <w:numId w:val="6"/>
-        </w:numPr>
-        <w:spacing w:after="60" w:line="336" w:lineRule="auto"/>
-        <w:jc w:val="both"/>
-      </w:pPr>
-      <w:r>
-        <w:rPr>
-          <w:rFonts w:eastAsia="Calibri"/>
-          <w:b/>
-          <w:bCs/>
-        </w:rPr>
-        <w:t>Technology neutrality</w:t>
-      </w:r>
-      <w:r>
-        <w:rPr>
-          <w:rFonts w:eastAsia="Calibri"/>
-        </w:rPr>
-        <w:t>: Nothing is made conditional on adopting AI models or platforms from a particular country or company. Education centres on competences rather than tools (judging where to use AI, verifying results, using it responsibly). The Singapore Convening, too, showed no single preference for any type of model.</w:t>
-      </w:r>
-    </w:p>
-    <w:p>
-      <w:pPr>
-        <w:pStyle w:val="a4"/>
-        <w:numPr>
-          <w:ilvl w:val="0"/>
-          <w:numId w:val="6"/>
-        </w:numPr>
-        <w:spacing w:after="60" w:line="336" w:lineRule="auto"/>
-        <w:jc w:val="both"/>
-      </w:pPr>
-      <w:r>
-        <w:rPr>
-          <w:rFonts w:eastAsia="Calibri"/>
-          <w:b/>
-          <w:bCs/>
-        </w:rPr>
-        <w:t>Complementarity</w:t>
-      </w:r>
-      <w:r>
-        <w:rPr>
-          <w:rFonts w:eastAsia="Calibri"/>
-        </w:rPr>
-        <w:t>: The Foundation does not replace China's AI programmes; it concentrates on gaps in target groups (teachers, citizens, MSMEs), in stages (after training) and in coordination (preventing duplication).</w:t>
-      </w:r>
-    </w:p>
-    <w:p>
-      <w:pPr>
-        <w:pStyle w:val="a4"/>
-        <w:numPr>
-          <w:ilvl w:val="0"/>
-          <w:numId w:val="6"/>
-        </w:numPr>
-        <w:spacing w:after="120" w:line="336" w:lineRule="auto"/>
-        <w:jc w:val="both"/>
-      </w:pPr>
-      <w:r>
-        <w:rPr>
-          <w:rFonts w:eastAsia="Calibri"/>
-          <w:b/>
-          <w:bCs/>
-        </w:rPr>
-        <w:t>Speak through outcomes</w:t>
-      </w:r>
-      <w:r>
-        <w:rPr>
-          <w:rFonts w:eastAsia="Calibri"/>
-        </w:rPr>
-        <w:t>: Reach (number of people trained), business integration and verified outcomes are reported separately. There is no assumption that every enterprise needs AI in every function.</w:t>
-      </w:r>
-    </w:p>
-    <w:p>
-      <w:pPr>
-        <w:keepNext/>
-        <w:spacing w:before="220" w:after="110" w:line="300" w:lineRule="auto"/>
-      </w:pPr>
-      <w:r>
-        <w:rPr>
-          <w:rFonts w:eastAsia="Calibri"/>
-          <w:b/>
-          <w:bCs/>
-          <w:color w:val="0F63A8"/>
-          <w:sz w:val="22"/>
-          <w:szCs w:val="22"/>
-        </w:rPr>
-        <w:t>5.2 Options</w:t>
+        <w:t>5.1 Options</w:t>
       </w:r>
     </w:p>
     <w:p>
@@ -8771,7 +7994,7 @@
           <w:sz w:val="22"/>
           <w:szCs w:val="22"/>
         </w:rPr>
-        <w:t>5.3 Priorities</w:t>
+        <w:t>5.2 Priorities</w:t>
       </w:r>
     </w:p>
     <w:p>
@@ -8799,7 +8022,7 @@
         <w:pStyle w:val="a4"/>
         <w:numPr>
           <w:ilvl w:val="0"/>
-          <w:numId w:val="7"/>
+          <w:numId w:val="6"/>
         </w:numPr>
         <w:spacing w:after="60" w:line="336" w:lineRule="auto"/>
         <w:jc w:val="both"/>
@@ -8839,7 +8062,7 @@
         <w:pStyle w:val="a4"/>
         <w:numPr>
           <w:ilvl w:val="0"/>
-          <w:numId w:val="7"/>
+          <w:numId w:val="6"/>
         </w:numPr>
         <w:spacing w:after="60" w:line="336" w:lineRule="auto"/>
         <w:jc w:val="both"/>
@@ -8864,7 +8087,7 @@
         <w:pStyle w:val="a4"/>
         <w:numPr>
           <w:ilvl w:val="0"/>
-          <w:numId w:val="7"/>
+          <w:numId w:val="6"/>
         </w:numPr>
         <w:spacing w:after="60" w:line="336" w:lineRule="auto"/>
         <w:jc w:val="both"/>
@@ -8889,7 +8112,7 @@
         <w:pStyle w:val="a4"/>
         <w:numPr>
           <w:ilvl w:val="0"/>
-          <w:numId w:val="7"/>
+          <w:numId w:val="6"/>
         </w:numPr>
         <w:spacing w:after="60" w:line="336" w:lineRule="auto"/>
         <w:jc w:val="both"/>
@@ -8914,7 +8137,7 @@
         <w:pStyle w:val="a4"/>
         <w:numPr>
           <w:ilvl w:val="0"/>
-          <w:numId w:val="7"/>
+          <w:numId w:val="6"/>
         </w:numPr>
         <w:spacing w:after="120" w:line="336" w:lineRule="auto"/>
         <w:jc w:val="both"/>
@@ -8932,46 +8155,6 @@
           <w:rFonts w:eastAsia="Calibri"/>
         </w:rPr>
         <w:t>: C3 depends on the Year of AI Cooperation being adopted. C4 is an internal ASEAN priority, and neutrality shows most clearly when it is designed around multiple Dialogue Partners.</w:t>
-      </w:r>
-    </w:p>
-    <w:p>
-      <w:pPr>
-        <w:spacing w:after="120" w:line="336" w:lineRule="auto"/>
-        <w:jc w:val="both"/>
-      </w:pPr>
-      <w:r>
-        <w:rPr>
-          <w:rFonts w:eastAsia="Calibri"/>
-          <w:b/>
-          <w:bCs/>
-        </w:rPr>
-        <w:t>Where C5 fits.</w:t>
-      </w:r>
-      <w:r>
-        <w:rPr>
-          <w:rFonts w:eastAsia="Calibri"/>
-        </w:rPr>
-        <w:t xml:space="preserve"> It is the end point of the MSME track. As AIM ASEAN is scheduled to end in 2027, follow-up funding will be discussed alongside it, with the aim of starting in the first half of 2027, depending on whether the MSME declaration is adopted at the November summit.</w:t>
-      </w:r>
-    </w:p>
-    <w:p>
-      <w:pPr>
-        <w:spacing w:after="120" w:line="336" w:lineRule="auto"/>
-        <w:jc w:val="both"/>
-      </w:pPr>
-      <w:r>
-        <w:rPr>
-          <w:rFonts w:eastAsia="Calibri"/>
-          <w:b/>
-          <w:bCs/>
-        </w:rPr>
-        <w:t>The limits of B3.</w:t>
-      </w:r>
-      <w:r>
-        <w:rPr>
-          <w:rFonts w:eastAsia="Calibri"/>
-        </w:rPr>
-        <w:t xml:space="preserve"> The language-model layer is not the Foundation's core business. Its contribution is confined to experience of AI education in local languages and to terminology; it does not release learner data for model training.</w:t>
       </w:r>
     </w:p>
     <w:p>
@@ -8988,143 +8171,7 @@
           <w:sz w:val="22"/>
           <w:szCs w:val="22"/>
         </w:rPr>
-        <w:t>5.4 What the Foundation Will Not Do</w:t>
-      </w:r>
-    </w:p>
-    <w:p>
-      <w:pPr>
-        <w:pStyle w:val="a4"/>
-        <w:numPr>
-          <w:ilvl w:val="0"/>
-          <w:numId w:val="2"/>
-        </w:numPr>
-        <w:spacing w:after="60" w:line="336" w:lineRule="auto"/>
-        <w:jc w:val="both"/>
-      </w:pPr>
-      <w:r>
-        <w:rPr>
-          <w:rFonts w:eastAsia="Calibri"/>
-        </w:rPr>
-        <w:t>Transferring or jointly holding learners' personal data and learning data, or providing data for AI model training</w:t>
-      </w:r>
-    </w:p>
-    <w:p>
-      <w:pPr>
-        <w:pStyle w:val="a4"/>
-        <w:numPr>
-          <w:ilvl w:val="0"/>
-          <w:numId w:val="2"/>
-        </w:numPr>
-        <w:spacing w:after="60" w:line="336" w:lineRule="auto"/>
-        <w:jc w:val="both"/>
-      </w:pPr>
-      <w:r>
-        <w:rPr>
-          <w:rFonts w:eastAsia="Calibri"/>
-        </w:rPr>
-        <w:t>Linkages conditional on adopting AI models or platforms from a particular country or company</w:t>
-      </w:r>
-    </w:p>
-    <w:p>
-      <w:pPr>
-        <w:pStyle w:val="a4"/>
-        <w:numPr>
-          <w:ilvl w:val="0"/>
-          <w:numId w:val="2"/>
-        </w:numPr>
-        <w:spacing w:after="60" w:line="336" w:lineRule="auto"/>
-        <w:jc w:val="both"/>
-      </w:pPr>
-      <w:r>
-        <w:rPr>
-          <w:rFonts w:eastAsia="Calibri"/>
-        </w:rPr>
-        <w:t>Repackaging ASEAN assets under the counterpart's programme brands</w:t>
-      </w:r>
-    </w:p>
-    <w:p>
-      <w:pPr>
-        <w:pStyle w:val="a4"/>
-        <w:numPr>
-          <w:ilvl w:val="0"/>
-          <w:numId w:val="2"/>
-        </w:numPr>
-        <w:spacing w:after="60" w:line="336" w:lineRule="auto"/>
-        <w:jc w:val="both"/>
-      </w:pPr>
-      <w:r>
-        <w:rPr>
-          <w:rFonts w:eastAsia="Calibri"/>
-        </w:rPr>
-        <w:t>School-level programmes run directly, bypassing member states' Ministries of Education</w:t>
-      </w:r>
-    </w:p>
-    <w:p>
-      <w:pPr>
-        <w:pStyle w:val="a4"/>
-        <w:numPr>
-          <w:ilvl w:val="0"/>
-          <w:numId w:val="2"/>
-        </w:numPr>
-        <w:spacing w:after="60" w:line="336" w:lineRule="auto"/>
-        <w:jc w:val="both"/>
-      </w:pPr>
-      <w:r>
-        <w:rPr>
-          <w:rFonts w:eastAsia="Calibri"/>
-        </w:rPr>
-        <w:t>Stating ASEAN positions on AI standards or norms (beyond the Foundation's mandate)</w:t>
-      </w:r>
-    </w:p>
-    <w:p>
-      <w:pPr>
-        <w:pStyle w:val="a4"/>
-        <w:numPr>
-          <w:ilvl w:val="0"/>
-          <w:numId w:val="2"/>
-        </w:numPr>
-        <w:spacing w:after="60" w:line="336" w:lineRule="auto"/>
-        <w:jc w:val="both"/>
-      </w:pPr>
-      <w:r>
-        <w:rPr>
-          <w:rFonts w:eastAsia="Calibri"/>
-        </w:rPr>
-        <w:t>Using internal reports or information on participating companies in external materials without the consent of the LIP and the companies</w:t>
-      </w:r>
-    </w:p>
-    <w:p>
-      <w:pPr>
-        <w:pStyle w:val="a4"/>
-        <w:numPr>
-          <w:ilvl w:val="0"/>
-          <w:numId w:val="2"/>
-        </w:numPr>
-        <w:spacing w:after="120" w:line="336" w:lineRule="auto"/>
-        <w:jc w:val="both"/>
-      </w:pPr>
-      <w:r>
-        <w:rPr>
-          <w:rFonts w:eastAsia="Calibri"/>
-        </w:rPr>
-        <w:t>Presenting follow-up plans still subject to partner agreement as if they were Foundation commitments</w:t>
-      </w:r>
-    </w:p>
-    <w:p>
-      <w:pPr>
-        <w:keepNext/>
-        <w:spacing w:before="220" w:after="110" w:line="300" w:lineRule="auto"/>
-      </w:pPr>
-      <w:r>
-        <w:rPr>
-          <w:rFonts w:eastAsia="Calibri"/>
-          <w:b/>
-          <w:bCs/>
-          <w:color w:val="0F63A8"/>
-          <w:sz w:val="22"/>
-          <w:szCs w:val="22"/>
-        </w:rPr>
-        <w:t>5.5 Phased Roadmap</w:t>
+        <w:t>5.3 Phased Roadmap</w:t>
       </w:r>
     </w:p>
     <w:p>
@@ -9744,7 +8791,7 @@
               <w:rPr>
                 <w:rFonts w:eastAsia="Calibri"/>
               </w:rPr>
-              <w:t>Apply the technology neutrality principle in 5.1. Describe training content in terms of competencies rather than tools, and leave the choice of tools to member states and learners. Cite as evidence the record showing no single preferred model type at the Singapore Convening, and the operational experience of working with Google and Huawei separately (2021 ASEAN Seeds for the Future MoU).</w:t>
+              <w:t>Apply the principle of technology neutrality. Describe training content in terms of competencies rather than tools, and leave the choice of tools to member states and learners. Cite as evidence the record showing no single preferred model type at the Singapore Convening, and the operational experience of working with Google and Huawei separately (2021 ASEAN Seeds for the Future MoU).</w:t>
             </w:r>
           </w:p>
         </w:tc>
@@ -10289,7 +9336,7 @@
               <w:rPr>
                 <w:rFonts w:eastAsia="Calibri"/>
               </w:rPr>
-              <w:t>State the definition and reference date for each indicator. Distinguish between reach, business integration and verified outcomes (5.1, Principle 6).</w:t>
+              <w:t>State the definition and reference date for each indicator. Distinguish between reach, business integration and verified outcomes.</w:t>
             </w:r>
           </w:p>
         </w:tc>
@@ -12084,12 +11131,6 @@
     </w:lvlOverride>
   </w:num>
   <w:num w:numId="6">
-    <w:abstractNumId w:val="2"/>
-    <w:lvlOverride w:ilvl="0">
-      <w:startOverride w:val="1"/>
-    </w:lvlOverride>
-  </w:num>
-  <w:num w:numId="7">
     <w:abstractNumId w:val="2"/>
     <w:lvlOverride w:ilvl="0">
       <w:startOverride w:val="1"/>

</xml_diff>